<commit_message>
minor edits for sync master
</commit_message>
<xml_diff>
--- a/docs/PSYC-106.docx
+++ b/docs/PSYC-106.docx
@@ -23,7 +23,7 @@
         <w:pStyle w:val="Date"/>
       </w:pPr>
       <w:r>
-        <w:t xml:space="preserve">Aug 26, 2025</w:t>
+        <w:t xml:space="preserve">Aug 28, 2025</w:t>
       </w:r>
     </w:p>
     <w:p>
@@ -364,7 +364,7 @@
         </w:numPr>
       </w:pPr>
       <w:r>
-        <w:t xml:space="preserve">What is Psychology?</w:t>
+        <w:t xml:space="preserve">What is Psychology</w:t>
       </w:r>
     </w:p>
     <w:p>
@@ -376,6 +376,18 @@
         </w:numPr>
       </w:pPr>
       <w:r>
+        <w:t xml:space="preserve">How did Psychology Begin?</w:t>
+      </w:r>
+    </w:p>
+    <w:p>
+      <w:pPr>
+        <w:pStyle w:val="Compact"/>
+        <w:numPr>
+          <w:ilvl w:val="0"/>
+          <w:numId w:val="1002"/>
+        </w:numPr>
+      </w:pPr>
+      <w:r>
         <w:t xml:space="preserve">What Do Psychologists Do?</w:t>
       </w:r>
     </w:p>
@@ -388,7 +400,7 @@
         </w:numPr>
       </w:pPr>
       <w:r>
-        <w:t xml:space="preserve">Thinking Critically with Psychological Science</w:t>
+        <w:t xml:space="preserve">Thinking Critically with Psychological Science - Limits of Psychology</w:t>
       </w:r>
     </w:p>
     <w:p>
@@ -7225,6 +7237,18 @@
       </w:pPr>
       <w:r>
         <w:t xml:space="preserve">Humanistic View</w:t>
+      </w:r>
+    </w:p>
+    <w:p>
+      <w:pPr>
+        <w:pStyle w:val="Compact"/>
+        <w:numPr>
+          <w:ilvl w:val="0"/>
+          <w:numId w:val="1054"/>
+        </w:numPr>
+      </w:pPr>
+      <w:r>
+        <w:t xml:space="preserve">Christianity &amp; Humanism</w:t>
       </w:r>
     </w:p>
     <w:p>
@@ -16465,6 +16489,18 @@
         </w:numPr>
       </w:pPr>
       <w:r>
+        <w:t xml:space="preserve">Aggression, Submission, and Assertion</w:t>
+      </w:r>
+    </w:p>
+    <w:p>
+      <w:pPr>
+        <w:pStyle w:val="Compact"/>
+        <w:numPr>
+          <w:ilvl w:val="0"/>
+          <w:numId w:val="1107"/>
+        </w:numPr>
+      </w:pPr>
+      <w:r>
         <w:t xml:space="preserve">Health Psychology</w:t>
       </w:r>
     </w:p>
@@ -18206,6 +18242,30 @@
       </w:pPr>
       <w:r>
         <w:t xml:space="preserve">Mood Disorders</w:t>
+      </w:r>
+    </w:p>
+    <w:p>
+      <w:pPr>
+        <w:pStyle w:val="Compact"/>
+        <w:numPr>
+          <w:ilvl w:val="0"/>
+          <w:numId w:val="1125"/>
+        </w:numPr>
+      </w:pPr>
+      <w:r>
+        <w:t xml:space="preserve">Depression</w:t>
+      </w:r>
+    </w:p>
+    <w:p>
+      <w:pPr>
+        <w:pStyle w:val="Compact"/>
+        <w:numPr>
+          <w:ilvl w:val="0"/>
+          <w:numId w:val="1125"/>
+        </w:numPr>
+      </w:pPr>
+      <w:r>
+        <w:t xml:space="preserve">Heartsick</w:t>
       </w:r>
     </w:p>
     <w:p>
@@ -19455,25 +19515,6 @@
     </w:p>
     <w:p>
       <w:pPr>
-        <w:pStyle w:val="Compact"/>
-        <w:numPr>
-          <w:ilvl w:val="0"/>
-          <w:numId w:val="1129"/>
-        </w:numPr>
-      </w:pPr>
-      <w:hyperlink r:id="rId89">
-        <w:r>
-          <w:rPr>
-            <w:rStyle w:val="Hyperlink"/>
-            <w:b/>
-            <w:bCs/>
-          </w:rPr>
-          <w:t xml:space="preserve">Criticism of America’s Diagnostic Bible - The DSM</w:t>
-        </w:r>
-      </w:hyperlink>
-    </w:p>
-    <w:p>
-      <w:pPr>
         <w:pStyle w:val="FirstParagraph"/>
       </w:pPr>
       <w:r>
@@ -19923,7 +19964,7 @@
           <w:numId w:val="1131"/>
         </w:numPr>
       </w:pPr>
-      <w:hyperlink r:id="rId90">
+      <w:hyperlink r:id="rId89">
         <w:r>
           <w:rPr>
             <w:rStyle w:val="Hyperlink"/>
@@ -19942,7 +19983,7 @@
           <w:numId w:val="1131"/>
         </w:numPr>
       </w:pPr>
-      <w:hyperlink r:id="rId91">
+      <w:hyperlink r:id="rId90">
         <w:r>
           <w:rPr>
             <w:rStyle w:val="Hyperlink"/>
@@ -20327,7 +20368,7 @@
           <w:numId w:val="1133"/>
         </w:numPr>
       </w:pPr>
-      <w:hyperlink r:id="rId92">
+      <w:hyperlink r:id="rId91">
         <w:r>
           <w:rPr>
             <w:rStyle w:val="Hyperlink"/>
@@ -20584,7 +20625,7 @@
           <w:numId w:val="1135"/>
         </w:numPr>
       </w:pPr>
-      <w:hyperlink r:id="rId93">
+      <w:hyperlink r:id="rId92">
         <w:r>
           <w:rPr>
             <w:rStyle w:val="Hyperlink"/>
@@ -21506,7 +21547,7 @@
           <w:numId w:val="1142"/>
         </w:numPr>
       </w:pPr>
-      <w:hyperlink r:id="rId94">
+      <w:hyperlink r:id="rId93">
         <w:r>
           <w:rPr>
             <w:rStyle w:val="Hyperlink"/>
@@ -21525,7 +21566,7 @@
           <w:numId w:val="1142"/>
         </w:numPr>
       </w:pPr>
-      <w:hyperlink r:id="rId95">
+      <w:hyperlink r:id="rId94">
         <w:r>
           <w:rPr>
             <w:rStyle w:val="Hyperlink"/>
@@ -21544,7 +21585,7 @@
           <w:numId w:val="1142"/>
         </w:numPr>
       </w:pPr>
-      <w:hyperlink r:id="rId96">
+      <w:hyperlink r:id="rId95">
         <w:r>
           <w:rPr>
             <w:rStyle w:val="Hyperlink"/>
@@ -21728,7 +21769,7 @@
         </w:numPr>
       </w:pPr>
       <w:r>
-        <w:t xml:space="preserve">Define the key terminology related to health psychology, stress and illness, and coping and well-being.</w:t>
+        <w:t xml:space="preserve">Define the key terminology associated with mental health treatment, psychological therapies, and biological treatments.</w:t>
       </w:r>
     </w:p>
     <w:p>
@@ -21740,7 +21781,7 @@
         </w:numPr>
       </w:pPr>
       <w:r>
-        <w:t xml:space="preserve">Describe how genetic and environmental factors influence obesity, how physiological reactions that occur under stress, and how the immune system is connected to stress responses.</w:t>
+        <w:t xml:space="preserve">Describe the major barriers to seeking help for psychological disorders, arguments for and against involuntary treatment, and general approaches to conducting major types of psychotherapy.</w:t>
       </w:r>
     </w:p>
     <w:p>
@@ -21752,7 +21793,7 @@
         </w:numPr>
       </w:pPr>
       <w:r>
-        <w:t xml:space="preserve">Apply your knowledge of persuasion and health to examine the effectiveness of different types of cigarette warnings, and of the beneficial effects of optimism to help you reframe stressful situations as positive opportunities.</w:t>
+        <w:t xml:space="preserve">Apply your knowledge to suggest what approach to therapy is likely most appropriate for a given situation, to identify major therapeutic techniques, and which drug therapies could be used for different psychological conditions.</w:t>
       </w:r>
     </w:p>
     <w:p>
@@ -21764,7 +21805,7 @@
         </w:numPr>
       </w:pPr>
       <w:r>
-        <w:t xml:space="preserve">Analyze whether media depictions of smoking affect smoking in adolescents, the claim that ulcers are caused by stress, and whether activities such as relaxation techniques, meditation, and biofeedback actually help people cope with stress and problems.</w:t>
+        <w:t xml:space="preserve">Analyze whether self-help options, such as popular books, are a useful therapy option, the pros and cons of the major types of psychotherapy and whether St. John’s Wort, a popular herbal remedy for depression, works.</w:t>
       </w:r>
     </w:p>
     <w:p>
@@ -21776,7 +21817,7 @@
         </w:numPr>
       </w:pPr>
       <w:r>
-        <w:t xml:space="preserve">Describe how control over the environment and positive and negative styles of coping influences well-being.</w:t>
+        <w:t xml:space="preserve">Describe how the drugs described in this module, and the other major medical approaches to therapy, affect brain functioning.</w:t>
       </w:r>
     </w:p>
     <w:p>
@@ -22473,7 +22514,7 @@
           <w:numId w:val="1149"/>
         </w:numPr>
       </w:pPr>
-      <w:hyperlink r:id="rId97">
+      <w:hyperlink r:id="rId96">
         <w:r>
           <w:rPr>
             <w:rStyle w:val="Hyperlink"/>
@@ -22754,7 +22795,7 @@
           <w:numId w:val="1152"/>
         </w:numPr>
       </w:pPr>
-      <w:hyperlink r:id="rId98">
+      <w:hyperlink r:id="rId97">
         <w:r>
           <w:rPr>
             <w:rStyle w:val="Hyperlink"/>
@@ -22773,7 +22814,7 @@
           <w:numId w:val="1152"/>
         </w:numPr>
       </w:pPr>
-      <w:hyperlink r:id="rId99">
+      <w:hyperlink r:id="rId98">
         <w:r>
           <w:rPr>
             <w:rStyle w:val="Hyperlink"/>
@@ -23128,7 +23169,7 @@
           <w:numId w:val="1155"/>
         </w:numPr>
       </w:pPr>
-      <w:hyperlink r:id="rId100">
+      <w:hyperlink r:id="rId99">
         <w:r>
           <w:rPr>
             <w:rStyle w:val="Hyperlink"/>
@@ -23147,7 +23188,7 @@
           <w:numId w:val="1155"/>
         </w:numPr>
       </w:pPr>
-      <w:hyperlink r:id="rId101">
+      <w:hyperlink r:id="rId100">
         <w:r>
           <w:rPr>
             <w:rStyle w:val="Hyperlink"/>
@@ -23166,7 +23207,7 @@
           <w:numId w:val="1155"/>
         </w:numPr>
       </w:pPr>
-      <w:hyperlink r:id="rId102">
+      <w:hyperlink r:id="rId101">
         <w:r>
           <w:rPr>
             <w:rStyle w:val="Hyperlink"/>
@@ -23350,7 +23391,7 @@
         </w:numPr>
       </w:pPr>
       <w:r>
-        <w:t xml:space="preserve">Define, and apply, the key terminology related to health psychology, stress and illness, and coping and well-being.</w:t>
+        <w:t xml:space="preserve">Define the key terminology associated with mental health treatment, psychological therapies, and biological treatments.</w:t>
       </w:r>
     </w:p>
     <w:p>
@@ -23362,7 +23403,7 @@
         </w:numPr>
       </w:pPr>
       <w:r>
-        <w:t xml:space="preserve">Describe how genetic and environmental factors influence obesity, how physiological reactions that occur under stress, and how the immune system is connected to stress responses.</w:t>
+        <w:t xml:space="preserve">Describe the major barriers to seeking help for psychological disorders, arguments for and against involuntary treatment, and general approaches to conducting major types of psychotherapy.</w:t>
       </w:r>
     </w:p>
     <w:p>
@@ -23374,7 +23415,7 @@
         </w:numPr>
       </w:pPr>
       <w:r>
-        <w:t xml:space="preserve">Apply your knowledge of persuasion and health to examine the effectiveness of different types of cigarette warnings, and of the beneficial effects of optimism to help you reframe stressful situations as positive opportunities.</w:t>
+        <w:t xml:space="preserve">Apply your knowledge to suggest what approach to therapy is likely most appropriate for a given situation, to identify major therapeutic techniques, and which drug therapies could be used for different psychological conditions.</w:t>
       </w:r>
     </w:p>
     <w:p>
@@ -23386,7 +23427,7 @@
         </w:numPr>
       </w:pPr>
       <w:r>
-        <w:t xml:space="preserve">Analyze whether media depictions of smoking affect smoking in adolescents, the claim that ulcers are caused by stress, and whether activities such as relaxation techniques, meditation, and biofeedback actually help people cope with stress and problems.</w:t>
+        <w:t xml:space="preserve">Analyze whether self-help options, such as popular books, are a useful therapy option, the pros and cons of the major types of psychotherapy and whether St. John’s Wort, a popular herbal remedy for depression, works.</w:t>
       </w:r>
     </w:p>
     <w:p>
@@ -23398,7 +23439,7 @@
         </w:numPr>
       </w:pPr>
       <w:r>
-        <w:t xml:space="preserve">Describe how control over the environment and positive and negative styles of coping influences well-being.</w:t>
+        <w:t xml:space="preserve">Describe how the drugs described in this module, and the other major medical approaches to therapy, affect brain functioning.</w:t>
       </w:r>
     </w:p>
     <w:p>

</xml_diff>